<commit_message>
fix(control): update measured linkage and sensor baselines
</commit_message>
<xml_diff>
--- a/experiments/h_ball_control_simulink/钢球水管平衡系统算法与Simulink仿真说明.docx
+++ b/experiments/h_ball_control_simulink/钢球水管平衡系统算法与Simulink仿真说明.docx
@@ -70,7 +70,7 @@
           <w:color w:val="111827"/>
           <w:sz w:val="21"/>
         </w:rPr>
-        <w:t>RS00关节电机直接驱动51.5 mm主动杆，经65.5 mm连杆带动250 mm水管摇杆；PSoC Edge E84直接控制RS00，MSPM0以500 Hz采集IMU，树莓派提供视觉位置。</w:t>
+        <w:t>RS00关节电机直接驱动35.0 mm主动杆，经55.5 mm连杆带动300.1 mm水管摇杆；水管有效滚动段250 mm。PSoC Edge E84直接控制RS00，MSPM0发布车身IMU，树莓派提供视觉位置。</w:t>
       </w:r>
     </w:p>
     <w:p>
@@ -84,7 +84,7 @@
           <w:color w:val="667085"/>
           <w:sz w:val="22"/>
         </w:rPr>
-        <w:t>版本：V1.1（100 Hz仿真基线）</w:t>
+        <w:t>版本：V1.3（实测连杆、实机视觉与约30 Hz IMU基线）</w:t>
       </w:r>
     </w:p>
     <w:p>
@@ -98,7 +98,7 @@
           <w:color w:val="667085"/>
           <w:sz w:val="22"/>
         </w:rPr>
-        <w:t>日期：2026年7月30日</w:t>
+        <w:t>日期：2026年7月31日</w:t>
       </w:r>
     </w:p>
     <w:p>
@@ -129,12 +129,17 @@
     </w:p>
     <w:p>
       <w:pPr>
-        <w:numPr>
-          <w:ilvl w:val="0"/>
-          <w:numId w:val="91"/>
-        </w:numPr>
         <w:spacing w:after="160"/>
+        <w:ind w:left="576" w:hanging="403"/>
       </w:pPr>
+      <w:r>
+        <w:rPr>
+          <w:rFonts w:ascii="Calibri" w:hAnsi="Calibri" w:eastAsia="Microsoft YaHei"/>
+          <w:color w:val="111827"/>
+          <w:sz w:val="22"/>
+        </w:rPr>
+        <w:t xml:space="preserve">1.  </w:t>
+      </w:r>
       <w:r>
         <w:rPr>
           <w:rFonts w:ascii="Calibri" w:hAnsi="Calibri" w:eastAsia="Microsoft YaHei"/>
@@ -146,12 +151,17 @@
     </w:p>
     <w:p>
       <w:pPr>
-        <w:numPr>
-          <w:ilvl w:val="0"/>
-          <w:numId w:val="91"/>
-        </w:numPr>
         <w:spacing w:after="160"/>
+        <w:ind w:left="576" w:hanging="403"/>
       </w:pPr>
+      <w:r>
+        <w:rPr>
+          <w:rFonts w:ascii="Calibri" w:hAnsi="Calibri" w:eastAsia="Microsoft YaHei"/>
+          <w:color w:val="111827"/>
+          <w:sz w:val="22"/>
+        </w:rPr>
+        <w:t xml:space="preserve">2.  </w:t>
+      </w:r>
       <w:r>
         <w:rPr>
           <w:rFonts w:ascii="Calibri" w:hAnsi="Calibri" w:eastAsia="Microsoft YaHei"/>
@@ -163,12 +173,17 @@
     </w:p>
     <w:p>
       <w:pPr>
-        <w:numPr>
-          <w:ilvl w:val="0"/>
-          <w:numId w:val="91"/>
-        </w:numPr>
         <w:spacing w:after="160"/>
+        <w:ind w:left="576" w:hanging="403"/>
       </w:pPr>
+      <w:r>
+        <w:rPr>
+          <w:rFonts w:ascii="Calibri" w:hAnsi="Calibri" w:eastAsia="Microsoft YaHei"/>
+          <w:color w:val="111827"/>
+          <w:sz w:val="22"/>
+        </w:rPr>
+        <w:t xml:space="preserve">3.  </w:t>
+      </w:r>
       <w:r>
         <w:rPr>
           <w:rFonts w:ascii="Calibri" w:hAnsi="Calibri" w:eastAsia="Microsoft YaHei"/>
@@ -180,12 +195,17 @@
     </w:p>
     <w:p>
       <w:pPr>
-        <w:numPr>
-          <w:ilvl w:val="0"/>
-          <w:numId w:val="91"/>
-        </w:numPr>
         <w:spacing w:after="160"/>
+        <w:ind w:left="576" w:hanging="403"/>
       </w:pPr>
+      <w:r>
+        <w:rPr>
+          <w:rFonts w:ascii="Calibri" w:hAnsi="Calibri" w:eastAsia="Microsoft YaHei"/>
+          <w:color w:val="111827"/>
+          <w:sz w:val="22"/>
+        </w:rPr>
+        <w:t xml:space="preserve">4.  </w:t>
+      </w:r>
       <w:r>
         <w:rPr>
           <w:rFonts w:ascii="Calibri" w:hAnsi="Calibri" w:eastAsia="Microsoft YaHei"/>
@@ -197,12 +217,17 @@
     </w:p>
     <w:p>
       <w:pPr>
-        <w:numPr>
-          <w:ilvl w:val="0"/>
-          <w:numId w:val="91"/>
-        </w:numPr>
         <w:spacing w:after="160"/>
+        <w:ind w:left="576" w:hanging="403"/>
       </w:pPr>
+      <w:r>
+        <w:rPr>
+          <w:rFonts w:ascii="Calibri" w:hAnsi="Calibri" w:eastAsia="Microsoft YaHei"/>
+          <w:color w:val="111827"/>
+          <w:sz w:val="22"/>
+        </w:rPr>
+        <w:t xml:space="preserve">5.  </w:t>
+      </w:r>
       <w:r>
         <w:rPr>
           <w:rFonts w:ascii="Calibri" w:hAnsi="Calibri" w:eastAsia="Microsoft YaHei"/>
@@ -214,12 +239,17 @@
     </w:p>
     <w:p>
       <w:pPr>
-        <w:numPr>
-          <w:ilvl w:val="0"/>
-          <w:numId w:val="91"/>
-        </w:numPr>
         <w:spacing w:after="160"/>
+        <w:ind w:left="576" w:hanging="403"/>
       </w:pPr>
+      <w:r>
+        <w:rPr>
+          <w:rFonts w:ascii="Calibri" w:hAnsi="Calibri" w:eastAsia="Microsoft YaHei"/>
+          <w:color w:val="111827"/>
+          <w:sz w:val="22"/>
+        </w:rPr>
+        <w:t xml:space="preserve">6.  </w:t>
+      </w:r>
       <w:r>
         <w:rPr>
           <w:rFonts w:ascii="Calibri" w:hAnsi="Calibri" w:eastAsia="Microsoft YaHei"/>
@@ -231,12 +261,17 @@
     </w:p>
     <w:p>
       <w:pPr>
-        <w:numPr>
-          <w:ilvl w:val="0"/>
-          <w:numId w:val="91"/>
-        </w:numPr>
         <w:spacing w:after="160"/>
+        <w:ind w:left="576" w:hanging="403"/>
       </w:pPr>
+      <w:r>
+        <w:rPr>
+          <w:rFonts w:ascii="Calibri" w:hAnsi="Calibri" w:eastAsia="Microsoft YaHei"/>
+          <w:color w:val="111827"/>
+          <w:sz w:val="22"/>
+        </w:rPr>
+        <w:t xml:space="preserve">7.  </w:t>
+      </w:r>
       <w:r>
         <w:rPr>
           <w:rFonts w:ascii="Calibri" w:hAnsi="Calibri" w:eastAsia="Microsoft YaHei"/>
@@ -248,12 +283,17 @@
     </w:p>
     <w:p>
       <w:pPr>
-        <w:numPr>
-          <w:ilvl w:val="0"/>
-          <w:numId w:val="91"/>
-        </w:numPr>
         <w:spacing w:after="160"/>
+        <w:ind w:left="576" w:hanging="403"/>
       </w:pPr>
+      <w:r>
+        <w:rPr>
+          <w:rFonts w:ascii="Calibri" w:hAnsi="Calibri" w:eastAsia="Microsoft YaHei"/>
+          <w:color w:val="111827"/>
+          <w:sz w:val="22"/>
+        </w:rPr>
+        <w:t xml:space="preserve">8.  </w:t>
+      </w:r>
       <w:r>
         <w:rPr>
           <w:rFonts w:ascii="Calibri" w:hAnsi="Calibri" w:eastAsia="Microsoft YaHei"/>
@@ -265,12 +305,17 @@
     </w:p>
     <w:p>
       <w:pPr>
-        <w:numPr>
-          <w:ilvl w:val="0"/>
-          <w:numId w:val="91"/>
-        </w:numPr>
         <w:spacing w:after="160"/>
+        <w:ind w:left="576" w:hanging="403"/>
       </w:pPr>
+      <w:r>
+        <w:rPr>
+          <w:rFonts w:ascii="Calibri" w:hAnsi="Calibri" w:eastAsia="Microsoft YaHei"/>
+          <w:color w:val="111827"/>
+          <w:sz w:val="22"/>
+        </w:rPr>
+        <w:t xml:space="preserve">9.  </w:t>
+      </w:r>
       <w:r>
         <w:rPr>
           <w:rFonts w:ascii="Calibri" w:hAnsi="Calibri" w:eastAsia="Microsoft YaHei"/>
@@ -282,12 +327,17 @@
     </w:p>
     <w:p>
       <w:pPr>
-        <w:numPr>
-          <w:ilvl w:val="0"/>
-          <w:numId w:val="91"/>
-        </w:numPr>
         <w:spacing w:after="160"/>
+        <w:ind w:left="576" w:hanging="403"/>
       </w:pPr>
+      <w:r>
+        <w:rPr>
+          <w:rFonts w:ascii="Calibri" w:hAnsi="Calibri" w:eastAsia="Microsoft YaHei"/>
+          <w:color w:val="111827"/>
+          <w:sz w:val="22"/>
+        </w:rPr>
+        <w:t xml:space="preserve">10.  </w:t>
+      </w:r>
       <w:r>
         <w:rPr>
           <w:rFonts w:ascii="Calibri" w:hAnsi="Calibri" w:eastAsia="Microsoft YaHei"/>
@@ -299,12 +349,17 @@
     </w:p>
     <w:p>
       <w:pPr>
-        <w:numPr>
-          <w:ilvl w:val="0"/>
-          <w:numId w:val="91"/>
-        </w:numPr>
         <w:spacing w:after="160"/>
+        <w:ind w:left="576" w:hanging="403"/>
       </w:pPr>
+      <w:r>
+        <w:rPr>
+          <w:rFonts w:ascii="Calibri" w:hAnsi="Calibri" w:eastAsia="Microsoft YaHei"/>
+          <w:color w:val="111827"/>
+          <w:sz w:val="22"/>
+        </w:rPr>
+        <w:t xml:space="preserve">11.  </w:t>
+      </w:r>
       <w:r>
         <w:rPr>
           <w:rFonts w:ascii="Calibri" w:hAnsi="Calibri" w:eastAsia="Microsoft YaHei"/>
@@ -316,12 +371,17 @@
     </w:p>
     <w:p>
       <w:pPr>
-        <w:numPr>
-          <w:ilvl w:val="0"/>
-          <w:numId w:val="91"/>
-        </w:numPr>
         <w:spacing w:after="160"/>
+        <w:ind w:left="576" w:hanging="403"/>
       </w:pPr>
+      <w:r>
+        <w:rPr>
+          <w:rFonts w:ascii="Calibri" w:hAnsi="Calibri" w:eastAsia="Microsoft YaHei"/>
+          <w:color w:val="111827"/>
+          <w:sz w:val="22"/>
+        </w:rPr>
+        <w:t xml:space="preserve">12.  </w:t>
+      </w:r>
       <w:r>
         <w:rPr>
           <w:rFonts w:ascii="Calibri" w:hAnsi="Calibri" w:eastAsia="Microsoft YaHei"/>
@@ -535,7 +595,7 @@
                 <w:color w:val="111827"/>
                 <w:sz w:val="18"/>
               </w:rPr>
-              <w:t>水管长度</w:t>
+              <w:t>水管有效滚动长度 / CB</w:t>
             </w:r>
           </w:p>
         </w:tc>
@@ -562,7 +622,7 @@
                 <w:color w:val="111827"/>
                 <w:sz w:val="18"/>
               </w:rPr>
-              <w:t>250 mm</w:t>
+              <w:t>250 mm / 300.1 mm</w:t>
             </w:r>
           </w:p>
         </w:tc>
@@ -589,7 +649,7 @@
                 <w:color w:val="111827"/>
                 <w:sz w:val="18"/>
               </w:rPr>
-              <w:t>用户给定</w:t>
+              <w:t>用户给定；两者不是同一个量</w:t>
             </w:r>
           </w:p>
         </w:tc>
@@ -645,7 +705,7 @@
                 <w:color w:val="111827"/>
                 <w:sz w:val="18"/>
               </w:rPr>
-              <w:t>51.5 mm / 65.5 mm</w:t>
+              <w:t>35.0 mm / 55.5 mm</w:t>
             </w:r>
           </w:p>
         </w:tc>
@@ -784,7 +844,7 @@
                 <w:color w:val="111827"/>
                 <w:sz w:val="18"/>
               </w:rPr>
-              <w:t>水管合页轴C高度</w:t>
+              <w:t>水管合页轴C高度 / O-C水平距</w:t>
             </w:r>
           </w:p>
         </w:tc>
@@ -811,7 +871,7 @@
                 <w:color w:val="111827"/>
                 <w:sz w:val="18"/>
               </w:rPr>
-              <w:t>建议82 mm</w:t>
+              <w:t>93 mm / 285 mm</w:t>
             </w:r>
           </w:p>
         </w:tc>
@@ -838,7 +898,7 @@
                 <w:color w:val="111827"/>
                 <w:sz w:val="18"/>
               </w:rPr>
-              <w:t>机构计算值，待装配验证</w:t>
+              <w:t>用户给定</w:t>
             </w:r>
           </w:p>
         </w:tc>
@@ -894,7 +954,7 @@
                 <w:color w:val="111827"/>
                 <w:sz w:val="18"/>
               </w:rPr>
-              <w:t>暂定±8°</w:t>
+              <w:t>暂定±6°</w:t>
             </w:r>
           </w:p>
         </w:tc>
@@ -921,7 +981,7 @@
                 <w:color w:val="111827"/>
                 <w:sz w:val="18"/>
               </w:rPr>
-              <w:t>几何安全值，待无球测试确认</w:t>
+              <w:t>新机构几何安全值，待无球测试确认</w:t>
             </w:r>
           </w:p>
         </w:tc>
@@ -950,7 +1010,7 @@
                 <w:color w:val="111827"/>
                 <w:sz w:val="18"/>
               </w:rPr>
-              <w:t>IMU频率</w:t>
+              <w:t>IMU唯一源样本率</w:t>
             </w:r>
           </w:p>
         </w:tc>
@@ -977,7 +1037,7 @@
                 <w:color w:val="111827"/>
                 <w:sz w:val="18"/>
               </w:rPr>
-              <w:t>500 Hz</w:t>
+              <w:t>约29.1 Hz</w:t>
             </w:r>
           </w:p>
         </w:tc>
@@ -1004,7 +1064,7 @@
                 <w:color w:val="111827"/>
                 <w:sz w:val="18"/>
               </w:rPr>
-              <w:t>用户给定/部署约束</w:t>
+              <w:t>当前WIT 9600 bit/s理论上限</w:t>
             </w:r>
           </w:p>
         </w:tc>
@@ -2279,7 +2339,7 @@
           <w:rFonts w:ascii="Calibri" w:hAnsi="Calibri" w:eastAsia="Microsoft YaHei"/>
           <w:color w:val="111827"/>
         </w:rPr>
-        <w:t>以水管固定端合页轴C为原点。O为RS00轴心，A为主动杆末端，B为蓝色连杆与水管的连接点。模型当前采用O=(232,−44) mm，即O在C右侧232 mm、低44 mm；水管水平时B位于C右侧250 mm。</w:t>
+        <w:t>以右侧水管固定端合页轴C为原点。O为左侧RS00轴心，A为主动杆末端，B为蓝色连杆与水管的连接点。模型采用O=(−285,−55) mm；水管水平时B=(−300.1,0) mm，即C到B向左。</w:t>
       </w:r>
     </w:p>
     <w:p>
@@ -2307,7 +2367,7 @@
           <w:color w:val="0B2545"/>
           <w:sz w:val="21"/>
         </w:rPr>
-        <w:t>B = C + L[cosθ, sinθ]ᵀ，且  ‖B − A‖ = l</w:t>
+        <w:t>B = C + L[cos(θ+π), sin(θ+π)]ᵀ，且  ‖B − A‖ = l_AB</w:t>
       </w:r>
     </w:p>
     <w:p>
@@ -2317,7 +2377,7 @@
           <w:rFonts w:ascii="Calibri" w:hAnsi="Calibri" w:eastAsia="Microsoft YaHei"/>
           <w:color w:val="111827"/>
         </w:rPr>
-        <w:t>其中r=51.5 mm、l=65.5 mm、L=250 mm，q为RS00角度，θ为水管角度，q₀为装配零点偏置。每次控制先求期望水管角θ，再通过逆运动学求RS00目标角q。</w:t>
+        <w:t>其中r=35.0 mm、l=55.5 mm、L=300.1 mm，q为RS00角度，θ为相对车身的水管角，q₀为装配零点偏置。250 mm只表示钢球有效滚动段，不能代替CB进入四杆方程。每次控制先求期望水管角θ，再通过逆运动学求RS00目标角q。</w:t>
       </w:r>
     </w:p>
     <w:p>
@@ -2329,8 +2389,8 @@
       <w:r>
         <w:drawing>
           <wp:inline xmlns:a="http://schemas.openxmlformats.org/drawingml/2006/main" xmlns:pic="http://schemas.openxmlformats.org/drawingml/2006/picture">
-            <wp:extent cx="5760720" cy="3722784"/>
-            <wp:docPr id="2" name="Picture 2" descr="图2  两连杆机构仿真分析：−8°、0°、+8°构型，逆解、速度/力矩倍率和等效惯量随姿态变化。" title="图2"/>
+            <wp:extent cx="5760720" cy="3732731"/>
+            <wp:docPr id="2" name="Picture 2" descr="图2  两连杆机构仿真分析：−6°、0°、+6°构型，逆解、速度/力矩倍率和等效惯量随姿态变化。" title="图2"/>
             <wp:cNvGraphicFramePr>
               <a:graphicFrameLocks noChangeAspect="1"/>
             </wp:cNvGraphicFramePr>
@@ -2350,7 +2410,7 @@
                   <pic:spPr>
                     <a:xfrm>
                       <a:off x="0" y="0"/>
-                      <a:ext cx="5760720" cy="3722784"/>
+                      <a:ext cx="5760720" cy="3732731"/>
                     </a:xfrm>
                     <a:prstGeom prst="rect"/>
                   </pic:spPr>
@@ -2373,7 +2433,7 @@
           <w:color w:val="667085"/>
           <w:sz w:val="18"/>
         </w:rPr>
-        <w:t>图2  两连杆机构仿真分析：−8°、0°、+8°构型，逆解、速度/力矩倍率和等效惯量随姿态变化。</w:t>
+        <w:t>图2  两连杆机构仿真分析：−6°、0°、+6°构型，逆解、速度/力矩倍率和等效惯量随姿态变化。</w:t>
       </w:r>
     </w:p>
     <w:p>
@@ -2381,7 +2441,7 @@
         <w:pStyle w:val="Heading2"/>
       </w:pPr>
       <w:r>
-        <w:t>3.2 为什么建议C轴高度82 mm</w:t>
+        <w:t>3.2 C轴高度93 mm与工作区</w:t>
       </w:r>
     </w:p>
     <w:p>
@@ -2395,7 +2455,7 @@
           <w:color w:val="0B2545"/>
           <w:sz w:val="21"/>
         </w:rPr>
-        <w:t>H_C = H_O + 44 mm = 38 mm + 44 mm = 82 mm</w:t>
+        <w:t>H_C = 93 mm，H_O = 38 mm，ΔH = 55 mm，ΔX_OC = 285 mm</w:t>
       </w:r>
     </w:p>
     <w:p>
@@ -2405,7 +2465,7 @@
           <w:rFonts w:ascii="Calibri" w:hAnsi="Calibri" w:eastAsia="Microsoft YaHei"/>
           <w:color w:val="111827"/>
         </w:rPr>
-        <w:t>真正决定连杆几何的是C轴和O轴的相对高度，不是支撑块外形高度。水管水平时，B相对O的水平偏差约18 mm、竖直偏差44 mm，因此OB≈47.5 mm，满足两圆相交条件14 mm&lt;OB&lt;117 mm。</w:t>
+        <w:t>真正决定连杆几何的是C轴和O轴的相对位置，不是支撑块外形高度。水管水平时，B相对O为(−15.1,55) mm，因此OB≈57.0 mm，满足两圆相交条件20.5 mm&lt;OB&lt;90.5 mm。</w:t>
       </w:r>
     </w:p>
     <w:p>
@@ -2432,7 +2492,7 @@
           <w:color w:val="111827"/>
           <w:sz w:val="21"/>
         </w:rPr>
-        <w:t>机械图应优先标注“水管合页C轴中心距底板82 mm”。若水管外径为50 mm且台面直接托住水管底部，则台面约57 mm；若合页轴高出台面d mm，则实体台面高度为82−d mm。</w:t>
+        <w:t>机械图应标注“右侧水管合页C轴中心距底板93 mm、C轴相对O轴水平285 mm”。若水管外径为50 mm且C轴与管中心重合，管底约68 mm，满足支撑台不低于50 mm的约束。</w:t>
       </w:r>
     </w:p>
     <w:p>
@@ -2442,7 +2502,7 @@
           <w:rFonts w:ascii="Calibri" w:hAnsi="Calibri" w:eastAsia="Microsoft YaHei"/>
           <w:color w:val="111827"/>
         </w:rPr>
-        <w:t>纯几何计算表明，从水平装配分支连续运动时，理论范围约为−10.3°至+16.9°。负方向在−10.3°附近接近折叠极限，因此取对称±8°作为暂定硬限位，给加工误差、间隙和冲击留出约2°余量。</w:t>
+        <w:t>在当前|dθ/dq|≥0.03保护下，水平装配分支连续区约为−6.47°至+6.79°。因此取对称±6°作为暂定软件硬指令限位，并把正常反馈限制在±4°、端部恢复限制在±5.5°。</w:t>
       </w:r>
     </w:p>
     <w:p>
@@ -2456,7 +2516,7 @@
           <w:color w:val="0B2545"/>
           <w:sz w:val="21"/>
         </w:rPr>
-        <w:t>14 mm ≤ ‖B(θ) − O‖ ≤ 117 mm</w:t>
+        <w:t>20.5 mm ≤ ‖B(θ) − O‖ ≤ 90.5 mm</w:t>
       </w:r>
     </w:p>
     <w:p>
@@ -2466,7 +2526,7 @@
           <w:rFonts w:ascii="Calibri" w:hAnsi="Calibri" w:eastAsia="Microsoft YaHei"/>
           <w:color w:val="111827"/>
         </w:rPr>
-        <w:t>在±8°范围内，RS00约需运动−17.2°至+14.9°；最不利速度/力矩换算倍率约2.51。82 mm高度与±8°限位是一组配套设计，任何轴高、水平距离或孔中心距变化都需要重新计算和标定。</w:t>
+        <w:t>在±6°范围内，RS00相对水平零位约需运动−57.00°至+70.68°；最小|dθ/dq|=0.0467，最不利速度/力矩换算倍率约21.43。水管指令斜率因此从旧值1.2 rad/s降为0.35 rad/s。</w:t>
       </w:r>
     </w:p>
     <w:p>
@@ -2591,6 +2651,33 @@
           <w:color w:val="111827"/>
         </w:rPr>
         <w:t>其中φ为车体俯仰，aₓ为沿水管方向的车辆加速度，a_z为竖直振动。车辆向前加速会在车体坐标系中把钢球推向相反方向；因此仅靠相机看到球已经移动后再纠正，会产生明显滞后，必须使用IMU前馈。</w:t>
+      </w:r>
+    </w:p>
+    <w:p>
+      <w:pPr>
+        <w:spacing w:before="120" w:after="160" w:line="264" w:lineRule="auto"/>
+        <w:ind w:left="173" w:right="86"/>
+        <w:shd w:fill="E8EEF5"/>
+        <w:pBdr>
+          <w:left w:val="single" w:sz="18" w:space="8" w:color="1F4D78"/>
+        </w:pBdr>
+      </w:pPr>
+      <w:r>
+        <w:rPr>
+          <w:rFonts w:ascii="Calibri" w:hAnsi="Calibri" w:eastAsia="Microsoft YaHei"/>
+          <w:b/>
+          <w:color w:val="1F4D78"/>
+          <w:sz w:val="21"/>
+        </w:rPr>
+        <w:t xml:space="preserve">车身IMU能做什么  </w:t>
+      </w:r>
+      <w:r>
+        <w:rPr>
+          <w:rFonts w:ascii="Calibri" w:hAnsi="Calibri" w:eastAsia="Microsoft YaHei"/>
+          <w:color w:val="111827"/>
+          <w:sz w:val="21"/>
+        </w:rPr>
+        <w:t>IMU装在车身上正适合测量底座俯仰和车辆加速度，用于前馈补偿。它不能测量水管相对车身的倾角，也看不到连杆回差和支架变形；相对水管角必须由RS00编码器经过四杆正解得到，必要时在C轴增加直接角度编码器。</w:t>
       </w:r>
     </w:p>
     <w:p>
@@ -2939,7 +3026,7 @@
                 <w:color w:val="111827"/>
                 <w:sz w:val="18"/>
               </w:rPr>
-              <w:t>500 Hz；默认4 ms</w:t>
+              <w:t>约30 Hz唯一源样本；默认35 ms</w:t>
             </w:r>
           </w:p>
         </w:tc>
@@ -2966,7 +3053,7 @@
                 <w:color w:val="111827"/>
                 <w:sz w:val="18"/>
               </w:rPr>
-              <w:t>状态预测与车辆前馈</w:t>
+              <w:t>保持输入、车辆前馈</w:t>
             </w:r>
           </w:p>
         </w:tc>
@@ -3049,7 +3136,7 @@
                 <w:color w:val="111827"/>
                 <w:sz w:val="18"/>
               </w:rPr>
-              <w:t>500 Hz；约3.5 ms反馈延迟</w:t>
+              <w:t>模型500 Hz、约3.5 ms；实机待测</w:t>
             </w:r>
           </w:p>
         </w:tc>
@@ -3199,6 +3286,33 @@
     </w:p>
     <w:p>
       <w:pPr>
+        <w:spacing w:before="120" w:after="160" w:line="264" w:lineRule="auto"/>
+        <w:ind w:left="173" w:right="86"/>
+        <w:shd w:fill="EAF5EC"/>
+        <w:pBdr>
+          <w:left w:val="single" w:sz="18" w:space="8" w:color="2F6B3A"/>
+        </w:pBdr>
+      </w:pPr>
+      <w:r>
+        <w:rPr>
+          <w:rFonts w:ascii="Calibri" w:hAnsi="Calibri" w:eastAsia="Microsoft YaHei"/>
+          <w:b/>
+          <w:color w:val="2F6B3A"/>
+          <w:sz w:val="21"/>
+        </w:rPr>
+        <w:t xml:space="preserve">115200波特率升级评估  </w:t>
+      </w:r>
+      <w:r>
+        <w:rPr>
+          <w:rFonts w:ascii="Calibri" w:hAnsi="Calibri" w:eastAsia="Microsoft YaHei"/>
+          <w:color w:val="111827"/>
+          <w:sz w:val="21"/>
+        </w:rPr>
+        <w:t>三类11字节8N1帧每个完整组至少330 bit。9600 bit/s理论上限约29.1组/s；115200 bit/s理论上限约349.1组/s，可支持100 Hz或200 Hz完整组，但仍不能支持500 Hz。同一可行综合压力场景中，30 Hz基线RMS/峰值为17.78/45.73 mm；假设200 Hz唯一源样本和8 ms延迟后降为10.62/25.00 mm。两端波特率和WIT输出率必须一起修改。</w:t>
+      </w:r>
+    </w:p>
+    <w:p>
+      <w:pPr>
         <w:pStyle w:val="Heading2"/>
       </w:pPr>
       <w:r>
@@ -3226,7 +3340,7 @@
           <w:rFonts w:ascii="Calibri" w:hAnsi="Calibri" w:eastAsia="Microsoft YaHei"/>
           <w:color w:val="111827"/>
         </w:rPr>
-        <w:t>x为钢球位置，v为速度，d为摩擦变化、模型误差等合并扰动加速度。控制器每5 ms执行一次预测；新相机帧到达时，只使用一次帧号，并按照拍摄时间戳进行延迟测量更新。</w:t>
+        <w:t>x为钢球位置，v为速度，d为摩擦变化、模型误差等合并扰动加速度。控制器每5 ms执行一次预测；新相机帧和新IMU源样本只按各自源序号使用一次。当前200 Hz CAN姿态镜像中的重复值只做保持，不能刷新IMU新鲜度。</w:t>
       </w:r>
     </w:p>
     <w:p>
@@ -3304,7 +3418,7 @@
           <w:rFonts w:ascii="Calibri" w:hAnsi="Calibri" w:eastAsia="Microsoft YaHei"/>
           <w:color w:val="111827"/>
         </w:rPr>
-        <w:t>第一、第二项是车辆加速度与俯仰前馈；第三项补偿估计扰动；后三项是LQI反馈。输出再经过±8°硬限角、1.2 rad/s斜率限制、积分抗饱和、两连杆逆解和RS00安全限制。</w:t>
+        <w:t>第一、第二项是车辆加速度与俯仰前馈；第三项补偿估计扰动；后三项是LQI反馈。输出再经过±6°硬限角、0.35 rad/s斜率限制、积分抗饱和、两连杆逆解和RS00安全限制。</w:t>
       </w:r>
     </w:p>
     <w:p>
@@ -3523,7 +3637,7 @@
                 <w:color w:val="111827"/>
                 <w:sz w:val="18"/>
               </w:rPr>
-              <w:t>精密LQI，日常建议不超过±5°</w:t>
+              <w:t>精密LQI，日常建议不超过±4°</w:t>
             </w:r>
           </w:p>
         </w:tc>
@@ -3689,7 +3803,7 @@
                 <w:color w:val="111827"/>
                 <w:sz w:val="18"/>
               </w:rPr>
-              <w:t>允许短时使用±7°</w:t>
+              <w:t>允许短时使用±5.5°</w:t>
             </w:r>
           </w:p>
         </w:tc>
@@ -3772,7 +3886,7 @@
                 <w:color w:val="111827"/>
                 <w:sz w:val="18"/>
               </w:rPr>
-              <w:t>回中/救球模式，硬限位±8°</w:t>
+              <w:t>回中/救球模式，硬限位±6°</w:t>
             </w:r>
           </w:p>
         </w:tc>
@@ -3873,7 +3987,7 @@
           <w:rFonts w:ascii="Calibri" w:hAnsi="Calibri" w:eastAsia="Microsoft YaHei"/>
           <w:color w:val="111827"/>
         </w:rPr>
-        <w:t>±8°能抵消的理想稳态轴向加速度约为g·tan8°≈1.38 m/s²，但还必须给位置反馈和车体俯仰留角度余量。因此正常地图规划建议先把车辆加减速度限制在0.6–0.8 m/s²，并限制加加速度；3 m/s²冲击超过机构稳态补偿能力，不是更换算法就能消除的。</w:t>
+        <w:t>±6°能抵消的理想稳态轴向加速度约为g·tan6°≈1.03 m/s²，但还必须给位置反馈和车体俯仰留角度余量。因此正常地图规划建议先把车辆加减速度限制在0.4–0.6 m/s²，并限制加加速度；3 m/s²冲击超过机构稳态补偿能力，不是更换算法就能消除的。</w:t>
       </w:r>
     </w:p>
     <w:p>
@@ -3891,7 +4005,7 @@
           <w:rFonts w:ascii="Calibri" w:hAnsi="Calibri" w:eastAsia="Microsoft YaHei"/>
           <w:color w:val="111827"/>
         </w:rPr>
-        <w:t>仿真采用“控制器—限幅/延迟—RS00与两连杆—钢球非线性对象—相机/IMU传感器—控制器”的闭环结构。固定步长为1/3000 s，使500 Hz、200 Hz和100 Hz任务落在公共仿真网格上。</w:t>
+        <w:t>仿真采用“控制器—限幅/延迟—RS00与两连杆—钢球非线性对象—相机/IMU传感器—控制器”的闭环结构。固定步长为1/3000 s，使约30 Hz IMU源样本、200 Hz控制和100 Hz视觉落在公共仿真网格上。</w:t>
       </w:r>
     </w:p>
     <w:p>
@@ -4353,7 +4467,7 @@
                 <w:color w:val="111827"/>
                 <w:sz w:val="17"/>
               </w:rPr>
-              <w:t>500 Hz、偏置、噪声和处理延迟</w:t>
+              <w:t>约30 Hz唯一源样本、保持输出、偏置、噪声和处理延迟</w:t>
             </w:r>
           </w:p>
         </w:tc>
@@ -4567,12 +4681,17 @@
     </w:p>
     <w:p>
       <w:pPr>
-        <w:numPr>
-          <w:ilvl w:val="0"/>
-          <w:numId w:val="90"/>
-        </w:numPr>
         <w:spacing w:after="160"/>
+        <w:ind w:left="576" w:hanging="403"/>
       </w:pPr>
+      <w:r>
+        <w:rPr>
+          <w:rFonts w:ascii="Calibri" w:hAnsi="Calibri" w:eastAsia="Microsoft YaHei"/>
+          <w:color w:val="111827"/>
+          <w:sz w:val="22"/>
+        </w:rPr>
+        <w:t xml:space="preserve">•  </w:t>
+      </w:r>
       <w:r>
         <w:rPr>
           <w:rFonts w:ascii="Calibri" w:hAnsi="Calibri" w:eastAsia="Microsoft YaHei"/>
@@ -4584,12 +4703,17 @@
     </w:p>
     <w:p>
       <w:pPr>
-        <w:numPr>
-          <w:ilvl w:val="0"/>
-          <w:numId w:val="90"/>
-        </w:numPr>
         <w:spacing w:after="160"/>
+        <w:ind w:left="576" w:hanging="403"/>
       </w:pPr>
+      <w:r>
+        <w:rPr>
+          <w:rFonts w:ascii="Calibri" w:hAnsi="Calibri" w:eastAsia="Microsoft YaHei"/>
+          <w:color w:val="111827"/>
+          <w:sz w:val="22"/>
+        </w:rPr>
+        <w:t xml:space="preserve">•  </w:t>
+      </w:r>
       <w:r>
         <w:rPr>
           <w:rFonts w:ascii="Calibri" w:hAnsi="Calibri" w:eastAsia="Microsoft YaHei"/>
@@ -4601,12 +4725,17 @@
     </w:p>
     <w:p>
       <w:pPr>
-        <w:numPr>
-          <w:ilvl w:val="0"/>
-          <w:numId w:val="90"/>
-        </w:numPr>
         <w:spacing w:after="160"/>
+        <w:ind w:left="576" w:hanging="403"/>
       </w:pPr>
+      <w:r>
+        <w:rPr>
+          <w:rFonts w:ascii="Calibri" w:hAnsi="Calibri" w:eastAsia="Microsoft YaHei"/>
+          <w:color w:val="111827"/>
+          <w:sz w:val="22"/>
+        </w:rPr>
+        <w:t xml:space="preserve">•  </w:t>
+      </w:r>
       <w:r>
         <w:rPr>
           <w:rFonts w:ascii="Calibri" w:hAnsi="Calibri" w:eastAsia="Microsoft YaHei"/>
@@ -4618,12 +4747,17 @@
     </w:p>
     <w:p>
       <w:pPr>
-        <w:numPr>
-          <w:ilvl w:val="0"/>
-          <w:numId w:val="90"/>
-        </w:numPr>
         <w:spacing w:after="160"/>
+        <w:ind w:left="576" w:hanging="403"/>
       </w:pPr>
+      <w:r>
+        <w:rPr>
+          <w:rFonts w:ascii="Calibri" w:hAnsi="Calibri" w:eastAsia="Microsoft YaHei"/>
+          <w:color w:val="111827"/>
+          <w:sz w:val="22"/>
+        </w:rPr>
+        <w:t xml:space="preserve">•  </w:t>
+      </w:r>
       <w:r>
         <w:rPr>
           <w:rFonts w:ascii="Calibri" w:hAnsi="Calibri" w:eastAsia="Microsoft YaHei"/>
@@ -4635,12 +4769,17 @@
     </w:p>
     <w:p>
       <w:pPr>
-        <w:numPr>
-          <w:ilvl w:val="0"/>
-          <w:numId w:val="90"/>
-        </w:numPr>
         <w:spacing w:after="160"/>
+        <w:ind w:left="576" w:hanging="403"/>
       </w:pPr>
+      <w:r>
+        <w:rPr>
+          <w:rFonts w:ascii="Calibri" w:hAnsi="Calibri" w:eastAsia="Microsoft YaHei"/>
+          <w:color w:val="111827"/>
+          <w:sz w:val="22"/>
+        </w:rPr>
+        <w:t xml:space="preserve">•  </w:t>
+      </w:r>
       <w:r>
         <w:rPr>
           <w:rFonts w:ascii="Calibri" w:hAnsi="Calibri" w:eastAsia="Microsoft YaHei"/>
@@ -4652,12 +4791,17 @@
     </w:p>
     <w:p>
       <w:pPr>
-        <w:numPr>
-          <w:ilvl w:val="0"/>
-          <w:numId w:val="90"/>
-        </w:numPr>
         <w:spacing w:after="160"/>
+        <w:ind w:left="576" w:hanging="403"/>
       </w:pPr>
+      <w:r>
+        <w:rPr>
+          <w:rFonts w:ascii="Calibri" w:hAnsi="Calibri" w:eastAsia="Microsoft YaHei"/>
+          <w:color w:val="111827"/>
+          <w:sz w:val="22"/>
+        </w:rPr>
+        <w:t xml:space="preserve">•  </w:t>
+      </w:r>
       <w:r>
         <w:rPr>
           <w:rFonts w:ascii="Calibri" w:hAnsi="Calibri" w:eastAsia="Microsoft YaHei"/>
@@ -4727,7 +4871,7 @@
       <w:r>
         <w:drawing>
           <wp:inline xmlns:a="http://schemas.openxmlformats.org/drawingml/2006/main" xmlns:pic="http://schemas.openxmlformats.org/drawingml/2006/picture">
-            <wp:extent cx="5760720" cy="3679622"/>
+            <wp:extent cx="5760720" cy="3665230"/>
             <wp:docPr id="4" name="Picture 4" descr="图4  标称工况：参考位置、真实/估计位置与速度、水管角、滑移、RS00力矩和温度。该图用于验证闭环机理，不代表比赛1 cm稳态验收。" title="图4"/>
             <wp:cNvGraphicFramePr>
               <a:graphicFrameLocks noChangeAspect="1"/>
@@ -4748,7 +4892,7 @@
                   <pic:spPr>
                     <a:xfrm>
                       <a:off x="0" y="0"/>
-                      <a:ext cx="5760720" cy="3679622"/>
+                      <a:ext cx="5760720" cy="3665230"/>
                     </a:xfrm>
                     <a:prstGeom prst="rect"/>
                   </pic:spPr>
@@ -4781,7 +4925,7 @@
           <w:rFonts w:ascii="Calibri" w:hAnsi="Calibri" w:eastAsia="Microsoft YaHei"/>
           <w:color w:val="111827"/>
         </w:rPr>
-        <w:t>标称仿真中，卡尔曼估计能够跟随钢球真实位置和速度，水管命令受±8°限制，机构保持有效，RS00力矩远低于硬件峰值。参考位置包含±50 mm阶跃，因此其目的主要是验证回中和跟踪能力。</w:t>
+        <w:t>标称仿真中，卡尔曼估计能够跟随钢球真实位置和速度，水管命令受±6°限制，机构保持有效，RS00力矩远低于硬件峰值。参考位置包含±20 mm阶跃，用于验证新机构安全包线内的回中和跟踪能力。</w:t>
       </w:r>
     </w:p>
     <w:p>
@@ -5122,7 +5266,7 @@
                 <w:color w:val="111827"/>
                 <w:sz w:val="16"/>
               </w:rPr>
-              <w:t>6.49</w:t>
+              <w:t>7.381</w:t>
             </w:r>
           </w:p>
         </w:tc>
@@ -5149,7 +5293,7 @@
                 <w:color w:val="111827"/>
                 <w:sz w:val="16"/>
               </w:rPr>
-              <w:t>25.00</w:t>
+              <w:t>25.004</w:t>
             </w:r>
           </w:p>
         </w:tc>
@@ -5176,7 +5320,7 @@
                 <w:color w:val="111827"/>
                 <w:sz w:val="16"/>
               </w:rPr>
-              <w:t>1.15</w:t>
+              <w:t>0.671</w:t>
             </w:r>
           </w:p>
         </w:tc>
@@ -5203,7 +5347,7 @@
                 <w:color w:val="111827"/>
                 <w:sz w:val="16"/>
               </w:rPr>
-              <w:t>0.58</w:t>
+              <w:t>0.410</w:t>
             </w:r>
           </w:p>
         </w:tc>
@@ -5313,7 +5457,7 @@
                 <w:color w:val="111827"/>
                 <w:sz w:val="16"/>
               </w:rPr>
-              <w:t>6.42</w:t>
+              <w:t>8.492</w:t>
             </w:r>
           </w:p>
         </w:tc>
@@ -5340,7 +5484,7 @@
                 <w:color w:val="111827"/>
                 <w:sz w:val="16"/>
               </w:rPr>
-              <w:t>25.00</w:t>
+              <w:t>25.000</w:t>
             </w:r>
           </w:p>
         </w:tc>
@@ -5367,7 +5511,7 @@
                 <w:color w:val="111827"/>
                 <w:sz w:val="16"/>
               </w:rPr>
-              <w:t>1.18</w:t>
+              <w:t>0.933</w:t>
             </w:r>
           </w:p>
         </w:tc>
@@ -5394,7 +5538,7 @@
                 <w:color w:val="111827"/>
                 <w:sz w:val="16"/>
               </w:rPr>
-              <w:t>0.59</w:t>
+              <w:t>0.651</w:t>
             </w:r>
           </w:p>
         </w:tc>
@@ -5504,7 +5648,7 @@
                 <w:color w:val="111827"/>
                 <w:sz w:val="16"/>
               </w:rPr>
-              <w:t>6.57</w:t>
+              <w:t>21.113</w:t>
             </w:r>
           </w:p>
         </w:tc>
@@ -5531,7 +5675,7 @@
                 <w:color w:val="111827"/>
                 <w:sz w:val="16"/>
               </w:rPr>
-              <w:t>25.00</w:t>
+              <w:t>48.118</w:t>
             </w:r>
           </w:p>
         </w:tc>
@@ -5558,7 +5702,7 @@
                 <w:color w:val="111827"/>
                 <w:sz w:val="16"/>
               </w:rPr>
-              <w:t>1.18</w:t>
+              <w:t>2.314</w:t>
             </w:r>
           </w:p>
         </w:tc>
@@ -5585,7 +5729,7 @@
                 <w:color w:val="111827"/>
                 <w:sz w:val="16"/>
               </w:rPr>
-              <w:t>0.60</w:t>
+              <w:t>0.651</w:t>
             </w:r>
           </w:p>
         </w:tc>
@@ -5695,7 +5839,7 @@
                 <w:color w:val="111827"/>
                 <w:sz w:val="16"/>
               </w:rPr>
-              <w:t>6.89</w:t>
+              <w:t>18.317</w:t>
             </w:r>
           </w:p>
         </w:tc>
@@ -5722,7 +5866,7 @@
                 <w:color w:val="111827"/>
                 <w:sz w:val="16"/>
               </w:rPr>
-              <w:t>25.00</w:t>
+              <w:t>40.571</w:t>
             </w:r>
           </w:p>
         </w:tc>
@@ -5749,7 +5893,7 @@
                 <w:color w:val="111827"/>
                 <w:sz w:val="16"/>
               </w:rPr>
-              <w:t>1.61</w:t>
+              <w:t>2.096</w:t>
             </w:r>
           </w:p>
         </w:tc>
@@ -5776,7 +5920,7 @@
                 <w:color w:val="111827"/>
                 <w:sz w:val="16"/>
               </w:rPr>
-              <w:t>0.58</w:t>
+              <w:t>0.727</w:t>
             </w:r>
           </w:p>
         </w:tc>
@@ -5859,7 +6003,7 @@
                 <w:color w:val="111827"/>
                 <w:sz w:val="16"/>
               </w:rPr>
-              <w:t>最坏组合（优化）</w:t>
+              <w:t>可行组合（优化）</w:t>
             </w:r>
           </w:p>
         </w:tc>
@@ -5886,7 +6030,7 @@
                 <w:color w:val="111827"/>
                 <w:sz w:val="16"/>
               </w:rPr>
-              <w:t>10.48</w:t>
+              <w:t>17.782</w:t>
             </w:r>
           </w:p>
         </w:tc>
@@ -5913,7 +6057,7 @@
                 <w:color w:val="111827"/>
                 <w:sz w:val="16"/>
               </w:rPr>
-              <w:t>28.25</w:t>
+              <w:t>45.729</w:t>
             </w:r>
           </w:p>
         </w:tc>
@@ -5940,7 +6084,7 @@
                 <w:color w:val="111827"/>
                 <w:sz w:val="16"/>
               </w:rPr>
-              <w:t>71.91</w:t>
+              <w:t>44.141</w:t>
             </w:r>
           </w:p>
         </w:tc>
@@ -5967,7 +6111,7 @@
                 <w:color w:val="111827"/>
                 <w:sz w:val="16"/>
               </w:rPr>
-              <w:t>0.60</w:t>
+              <w:t>0.701</w:t>
             </w:r>
           </w:p>
         </w:tc>
@@ -6050,7 +6194,7 @@
                 <w:color w:val="111827"/>
                 <w:sz w:val="16"/>
               </w:rPr>
-              <w:t>最坏组合（仅KF-LQI）</w:t>
+              <w:t>可行组合（仅KF-LQI）</w:t>
             </w:r>
           </w:p>
         </w:tc>
@@ -6077,7 +6221,7 @@
                 <w:color w:val="111827"/>
                 <w:sz w:val="16"/>
               </w:rPr>
-              <w:t>13.17</w:t>
+              <w:t>33.260</w:t>
             </w:r>
           </w:p>
         </w:tc>
@@ -6104,7 +6248,7 @@
                 <w:color w:val="111827"/>
                 <w:sz w:val="16"/>
               </w:rPr>
-              <w:t>25.00</w:t>
+              <w:t>88.038</w:t>
             </w:r>
           </w:p>
         </w:tc>
@@ -6131,7 +6275,7 @@
                 <w:color w:val="111827"/>
                 <w:sz w:val="16"/>
               </w:rPr>
-              <w:t>52.73</w:t>
+              <w:t>119.095</w:t>
             </w:r>
           </w:p>
         </w:tc>
@@ -6158,7 +6302,7 @@
                 <w:color w:val="111827"/>
                 <w:sz w:val="16"/>
               </w:rPr>
-              <w:t>0.58</w:t>
+              <w:t>0.693</w:t>
             </w:r>
           </w:p>
         </w:tc>
@@ -6241,6 +6385,197 @@
                 <w:color w:val="111827"/>
                 <w:sz w:val="16"/>
               </w:rPr>
+              <w:t>超新机构包线组合</w:t>
+            </w:r>
+          </w:p>
+        </w:tc>
+        <w:tc>
+          <w:tcPr>
+            <w:tcW w:type="dxa" w:w="1000"/>
+            <w:tcMar>
+              <w:top w:w="80" w:type="dxa"/>
+              <w:start w:w="120" w:type="dxa"/>
+              <w:bottom w:w="80" w:type="dxa"/>
+              <w:end w:w="120" w:type="dxa"/>
+            </w:tcMar>
+            <w:vAlign w:val="center"/>
+          </w:tcPr>
+          <w:p>
+            <w:pPr>
+              <w:spacing w:before="0" w:after="0" w:line="252" w:lineRule="auto"/>
+              <w:jc w:val="center"/>
+            </w:pPr>
+            <w:r>
+              <w:rPr>
+                <w:rFonts w:ascii="Calibri" w:hAnsi="Calibri" w:eastAsia="Microsoft YaHei"/>
+                <w:b w:val="0"/>
+                <w:color w:val="111827"/>
+                <w:sz w:val="16"/>
+              </w:rPr>
+              <w:t>44.233</w:t>
+            </w:r>
+          </w:p>
+        </w:tc>
+        <w:tc>
+          <w:tcPr>
+            <w:tcW w:type="dxa" w:w="1050"/>
+            <w:tcMar>
+              <w:top w:w="80" w:type="dxa"/>
+              <w:start w:w="120" w:type="dxa"/>
+              <w:bottom w:w="80" w:type="dxa"/>
+              <w:end w:w="120" w:type="dxa"/>
+            </w:tcMar>
+            <w:vAlign w:val="center"/>
+          </w:tcPr>
+          <w:p>
+            <w:pPr>
+              <w:spacing w:before="0" w:after="0" w:line="252" w:lineRule="auto"/>
+              <w:jc w:val="center"/>
+            </w:pPr>
+            <w:r>
+              <w:rPr>
+                <w:rFonts w:ascii="Calibri" w:hAnsi="Calibri" w:eastAsia="Microsoft YaHei"/>
+                <w:b w:val="0"/>
+                <w:color w:val="111827"/>
+                <w:sz w:val="16"/>
+              </w:rPr>
+              <w:t>92.709</w:t>
+            </w:r>
+          </w:p>
+        </w:tc>
+        <w:tc>
+          <w:tcPr>
+            <w:tcW w:type="dxa" w:w="1150"/>
+            <w:tcMar>
+              <w:top w:w="80" w:type="dxa"/>
+              <w:start w:w="120" w:type="dxa"/>
+              <w:bottom w:w="80" w:type="dxa"/>
+              <w:end w:w="120" w:type="dxa"/>
+            </w:tcMar>
+            <w:vAlign w:val="center"/>
+          </w:tcPr>
+          <w:p>
+            <w:pPr>
+              <w:spacing w:before="0" w:after="0" w:line="252" w:lineRule="auto"/>
+              <w:jc w:val="center"/>
+            </w:pPr>
+            <w:r>
+              <w:rPr>
+                <w:rFonts w:ascii="Calibri" w:hAnsi="Calibri" w:eastAsia="Microsoft YaHei"/>
+                <w:b w:val="0"/>
+                <w:color w:val="111827"/>
+                <w:sz w:val="16"/>
+              </w:rPr>
+              <w:t>150.951</w:t>
+            </w:r>
+          </w:p>
+        </w:tc>
+        <w:tc>
+          <w:tcPr>
+            <w:tcW w:type="dxa" w:w="1050"/>
+            <w:tcMar>
+              <w:top w:w="80" w:type="dxa"/>
+              <w:start w:w="120" w:type="dxa"/>
+              <w:bottom w:w="80" w:type="dxa"/>
+              <w:end w:w="120" w:type="dxa"/>
+            </w:tcMar>
+            <w:vAlign w:val="center"/>
+          </w:tcPr>
+          <w:p>
+            <w:pPr>
+              <w:spacing w:before="0" w:after="0" w:line="252" w:lineRule="auto"/>
+              <w:jc w:val="center"/>
+            </w:pPr>
+            <w:r>
+              <w:rPr>
+                <w:rFonts w:ascii="Calibri" w:hAnsi="Calibri" w:eastAsia="Microsoft YaHei"/>
+                <w:b w:val="0"/>
+                <w:color w:val="111827"/>
+                <w:sz w:val="16"/>
+              </w:rPr>
+              <w:t>0.713</w:t>
+            </w:r>
+          </w:p>
+        </w:tc>
+        <w:tc>
+          <w:tcPr>
+            <w:tcW w:type="dxa" w:w="1250"/>
+            <w:tcMar>
+              <w:top w:w="80" w:type="dxa"/>
+              <w:start w:w="120" w:type="dxa"/>
+              <w:bottom w:w="80" w:type="dxa"/>
+              <w:end w:w="120" w:type="dxa"/>
+            </w:tcMar>
+            <w:vAlign w:val="center"/>
+          </w:tcPr>
+          <w:p>
+            <w:pPr>
+              <w:spacing w:before="0" w:after="0" w:line="252" w:lineRule="auto"/>
+              <w:jc w:val="center"/>
+            </w:pPr>
+            <w:r>
+              <w:rPr>
+                <w:rFonts w:ascii="Calibri" w:hAnsi="Calibri" w:eastAsia="Microsoft YaHei"/>
+                <w:b w:val="0"/>
+                <w:color w:val="111827"/>
+                <w:sz w:val="16"/>
+              </w:rPr>
+              <w:t>否</w:t>
+            </w:r>
+          </w:p>
+        </w:tc>
+        <w:tc>
+          <w:tcPr>
+            <w:tcW w:type="dxa" w:w="1280"/>
+            <w:tcMar>
+              <w:top w:w="80" w:type="dxa"/>
+              <w:start w:w="120" w:type="dxa"/>
+              <w:bottom w:w="80" w:type="dxa"/>
+              <w:end w:w="120" w:type="dxa"/>
+            </w:tcMar>
+            <w:vAlign w:val="center"/>
+          </w:tcPr>
+          <w:p>
+            <w:pPr>
+              <w:spacing w:before="0" w:after="0" w:line="252" w:lineRule="auto"/>
+              <w:jc w:val="center"/>
+            </w:pPr>
+            <w:r>
+              <w:rPr>
+                <w:rFonts w:ascii="Calibri" w:hAnsi="Calibri" w:eastAsia="Microsoft YaHei"/>
+                <w:b w:val="0"/>
+                <w:color w:val="111827"/>
+                <w:sz w:val="16"/>
+              </w:rPr>
+              <w:t>否</w:t>
+            </w:r>
+          </w:p>
+        </w:tc>
+      </w:tr>
+      <w:tr>
+        <w:tc>
+          <w:tcPr>
+            <w:tcW w:type="dxa" w:w="2580"/>
+            <w:tcMar>
+              <w:top w:w="80" w:type="dxa"/>
+              <w:start w:w="120" w:type="dxa"/>
+              <w:bottom w:w="80" w:type="dxa"/>
+              <w:end w:w="120" w:type="dxa"/>
+            </w:tcMar>
+            <w:vAlign w:val="center"/>
+          </w:tcPr>
+          <w:p>
+            <w:pPr>
+              <w:spacing w:before="0" w:after="0" w:line="252" w:lineRule="auto"/>
+              <w:jc w:val="left"/>
+            </w:pPr>
+            <w:r>
+              <w:rPr>
+                <w:rFonts w:ascii="Calibri" w:hAnsi="Calibri" w:eastAsia="Microsoft YaHei"/>
+                <w:b w:val="0"/>
+                <w:color w:val="111827"/>
+                <w:sz w:val="16"/>
+              </w:rPr>
               <w:t>3.0 m/s²超限脉冲</w:t>
             </w:r>
           </w:p>
@@ -6268,7 +6603,7 @@
                 <w:color w:val="111827"/>
                 <w:sz w:val="16"/>
               </w:rPr>
-              <w:t>22.68</w:t>
+              <w:t>82.692</w:t>
             </w:r>
           </w:p>
         </w:tc>
@@ -6295,7 +6630,7 @@
                 <w:color w:val="111827"/>
                 <w:sz w:val="16"/>
               </w:rPr>
-              <w:t>71.99</w:t>
+              <w:t>115.015</w:t>
             </w:r>
           </w:p>
         </w:tc>
@@ -6322,7 +6657,7 @@
                 <w:color w:val="111827"/>
                 <w:sz w:val="16"/>
               </w:rPr>
-              <w:t>272.92</w:t>
+              <w:t>240.595</w:t>
             </w:r>
           </w:p>
         </w:tc>
@@ -6349,7 +6684,7 @@
                 <w:color w:val="111827"/>
                 <w:sz w:val="16"/>
               </w:rPr>
-              <w:t>0.57</w:t>
+              <w:t>0.694</w:t>
             </w:r>
           </w:p>
         </w:tc>
@@ -6438,7 +6773,7 @@
           <w:color w:val="111827"/>
           <w:sz w:val="21"/>
         </w:rPr>
-        <w:t>压力测试统一从+25 mm初始误差开始，因此若要求从t=0起始终小于10 mm，所有场景必然不合格。前六项“机械安全”为真，只表示未掉球、连杆有效、端部余量和滑移满足原安全门槛。比赛报告应另行统计进入±10 mm所需时间，并在题目规定的评分区间检查峰值误差。</w:t>
+        <w:t>压力测试统一从+25 mm初始误差开始，因此若要求从t=0起始终小于10 mm，所有场景必然不合格。前六项“机械安全”为真，只表示未掉球、连杆有效、端部余量和滑移满足当前安全门槛。比赛报告应另行统计进入±10 mm所需时间，并在题目规定的评分区间检查峰值误差。</w:t>
       </w:r>
     </w:p>
     <w:p>
@@ -6448,7 +6783,7 @@
           <w:rFonts w:ascii="Calibri" w:hAnsi="Calibri" w:eastAsia="Microsoft YaHei"/>
           <w:color w:val="111827"/>
         </w:rPr>
-        <w:t>在相同最坏扰动下，加入车辆前馈和扰动估计后，RMS误差相对仅KF-LQI方案降低约20.4%。由于两套方案的端部保护触发时刻不同，本次优化方案峰值滑移反而较高，所以不能只按RMS选控制器，还要同时约束滑移和端部余量。3.0 m/s²脉冲产生71.99 mm峰值和272.92 mm/s滑移，说明该工况超出推荐物理包线。</w:t>
+        <w:t>在相同可行组合扰动下，加入车辆前馈和扰动估计后，RMS误差相对仅KF-LQI方案降低约46.5%，峰值滑移也由119.095降至44.141 mm/s。把WIT与MSPM0同时升级到115200 bit/s并获得200 Hz唯一IMU源样本的what-if结果为RMS 10.62 mm、峰值25.00 mm，较当前约30 Hz基线继续改善，但仍需硬件验证。3.0 m/s²脉冲产生115.015 mm峰值和240.595 mm/s滑移，说明该工况超出推荐物理包线。</w:t>
       </w:r>
     </w:p>
     <w:p>
@@ -6468,8 +6803,8 @@
       <w:r>
         <w:drawing>
           <wp:inline xmlns:a="http://schemas.openxmlformats.org/drawingml/2006/main" xmlns:pic="http://schemas.openxmlformats.org/drawingml/2006/picture">
-            <wp:extent cx="5760720" cy="3785122"/>
-            <wp:docPr id="6" name="Picture 6" descr="图6  相同200 Hz控制器和500 Hz IMU条件下，100、60与30 Hz视觉的位置误差对照。测试从+5 mm开始，红线为±10 mm题目误差带。" title="图6"/>
+            <wp:extent cx="5760720" cy="3750129"/>
+            <wp:docPr id="6" name="Picture 6" descr="图6  相同200 Hz控制器和约30 Hz唯一IMU源样本条件下，100、60与30 Hz视觉的位置误差对照。测试从+5 mm开始，红线为±10 mm题目误差带。" title="图6"/>
             <wp:cNvGraphicFramePr>
               <a:graphicFrameLocks noChangeAspect="1"/>
             </wp:cNvGraphicFramePr>
@@ -6489,7 +6824,7 @@
                   <pic:spPr>
                     <a:xfrm>
                       <a:off x="0" y="0"/>
-                      <a:ext cx="5760720" cy="3785122"/>
+                      <a:ext cx="5760720" cy="3750129"/>
                     </a:xfrm>
                     <a:prstGeom prst="rect"/>
                   </pic:spPr>
@@ -6512,7 +6847,7 @@
           <w:color w:val="667085"/>
           <w:sz w:val="18"/>
         </w:rPr>
-        <w:t>图6  相同200 Hz控制器和500 Hz IMU条件下，100、60与30 Hz视觉的位置误差对照。测试从+5 mm开始，红线为±10 mm题目误差带。</w:t>
+        <w:t>图6  相同200 Hz控制器和约30 Hz唯一IMU源样本条件下，100、60与30 Hz视觉的位置误差对照。测试从+5 mm开始，红线为±10 mm题目误差带。</w:t>
       </w:r>
     </w:p>
     <w:tbl>
@@ -6783,7 +7118,7 @@
                 <w:color w:val="111827"/>
                 <w:sz w:val="17"/>
               </w:rPr>
-              <w:t>1.750</w:t>
+              <w:t>4.199</w:t>
             </w:r>
           </w:p>
         </w:tc>
@@ -6810,7 +7145,7 @@
                 <w:color w:val="111827"/>
                 <w:sz w:val="17"/>
               </w:rPr>
-              <w:t>5.000</w:t>
+              <w:t>8.701</w:t>
             </w:r>
           </w:p>
         </w:tc>
@@ -6947,7 +7282,7 @@
                 <w:color w:val="111827"/>
                 <w:sz w:val="17"/>
               </w:rPr>
-              <w:t>1.585</w:t>
+              <w:t>4.853</w:t>
             </w:r>
           </w:p>
         </w:tc>
@@ -6974,7 +7309,7 @@
                 <w:color w:val="111827"/>
                 <w:sz w:val="17"/>
               </w:rPr>
-              <w:t>5.000</w:t>
+              <w:t>9.142</w:t>
             </w:r>
           </w:p>
         </w:tc>
@@ -7111,7 +7446,7 @@
                 <w:color w:val="111827"/>
                 <w:sz w:val="17"/>
               </w:rPr>
-              <w:t>1.866</w:t>
+              <w:t>4.978</w:t>
             </w:r>
           </w:p>
         </w:tc>
@@ -7138,7 +7473,7 @@
                 <w:color w:val="111827"/>
                 <w:sz w:val="17"/>
               </w:rPr>
-              <w:t>5.000</w:t>
+              <w:t>7.781</w:t>
             </w:r>
           </w:p>
         </w:tc>
@@ -7275,7 +7610,7 @@
                 <w:color w:val="111827"/>
                 <w:sz w:val="17"/>
               </w:rPr>
-              <w:t>2.721</w:t>
+              <w:t>48.173</w:t>
             </w:r>
           </w:p>
         </w:tc>
@@ -7302,7 +7637,7 @@
                 <w:color w:val="111827"/>
                 <w:sz w:val="17"/>
               </w:rPr>
-              <w:t>6.821</w:t>
+              <w:t>101.288</w:t>
             </w:r>
           </w:p>
         </w:tc>
@@ -7329,7 +7664,7 @@
                 <w:color w:val="111827"/>
                 <w:sz w:val="17"/>
               </w:rPr>
-              <w:t>100%</w:t>
+              <w:t>33.72%</w:t>
             </w:r>
           </w:p>
         </w:tc>
@@ -7356,7 +7691,7 @@
                 <w:color w:val="111827"/>
                 <w:sz w:val="17"/>
               </w:rPr>
-              <w:t>是</w:t>
+              <w:t>否</w:t>
             </w:r>
           </w:p>
         </w:tc>
@@ -7439,7 +7774,7 @@
                 <w:color w:val="111827"/>
                 <w:sz w:val="17"/>
               </w:rPr>
-              <w:t>2.699</w:t>
+              <w:t>46.096</w:t>
             </w:r>
           </w:p>
         </w:tc>
@@ -7466,7 +7801,7 @@
                 <w:color w:val="111827"/>
                 <w:sz w:val="17"/>
               </w:rPr>
-              <w:t>7.222</w:t>
+              <w:t>97.453</w:t>
             </w:r>
           </w:p>
         </w:tc>
@@ -7493,7 +7828,7 @@
                 <w:color w:val="111827"/>
                 <w:sz w:val="17"/>
               </w:rPr>
-              <w:t>100%</w:t>
+              <w:t>35.82%</w:t>
             </w:r>
           </w:p>
         </w:tc>
@@ -7520,7 +7855,7 @@
                 <w:color w:val="111827"/>
                 <w:sz w:val="17"/>
               </w:rPr>
-              <w:t>是</w:t>
+              <w:t>否</w:t>
             </w:r>
           </w:p>
         </w:tc>
@@ -7603,7 +7938,7 @@
                 <w:color w:val="111827"/>
                 <w:sz w:val="17"/>
               </w:rPr>
-              <w:t>2.709</w:t>
+              <w:t>49.321</w:t>
             </w:r>
           </w:p>
         </w:tc>
@@ -7630,7 +7965,7 @@
                 <w:color w:val="111827"/>
                 <w:sz w:val="17"/>
               </w:rPr>
-              <w:t>6.471</w:t>
+              <w:t>112.865</w:t>
             </w:r>
           </w:p>
         </w:tc>
@@ -7657,7 +7992,7 @@
                 <w:color w:val="111827"/>
                 <w:sz w:val="17"/>
               </w:rPr>
-              <w:t>100%</w:t>
+              <w:t>34.54%</w:t>
             </w:r>
           </w:p>
         </w:tc>
@@ -7684,7 +8019,7 @@
                 <w:color w:val="111827"/>
                 <w:sz w:val="17"/>
               </w:rPr>
-              <w:t>是</w:t>
+              <w:t>否</w:t>
             </w:r>
           </w:p>
         </w:tc>
@@ -7699,16 +8034,16 @@
       <w:pPr>
         <w:spacing w:before="120" w:after="160" w:line="264" w:lineRule="auto"/>
         <w:ind w:left="173" w:right="86"/>
-        <w:shd w:fill="EAF5EC"/>
+        <w:shd w:fill="FFF4CE"/>
         <w:pBdr>
-          <w:left w:val="single" w:sz="18" w:space="8" w:color="2F6B3A"/>
+          <w:left w:val="single" w:sz="18" w:space="8" w:color="7A5A00"/>
         </w:pBdr>
       </w:pPr>
       <w:r>
         <w:rPr>
           <w:rFonts w:ascii="Calibri" w:hAnsi="Calibri" w:eastAsia="Microsoft YaHei"/>
           <w:b/>
-          <w:color w:val="2F6B3A"/>
+          <w:color w:val="7A5A00"/>
           <w:sz w:val="21"/>
         </w:rPr>
         <w:t xml:space="preserve">结论  </w:t>
@@ -7719,7 +8054,17 @@
           <w:color w:val="111827"/>
           <w:sz w:val="21"/>
         </w:rPr>
-        <w:t>100 Hz、60 Hz和30 Hz在本次两组固定随机场景中均通过±10 mm严格判据。100 Hz不在每个单次随机指标上都最小，原因包括噪声、丢帧相位、整帧延迟量化以及滤波器尚未针对各帧率重新整定；不能据此解释成较低帧率更优。100 Hz仍提供更密集的新测量和更小的时间量化上限，部署时必须携带曝光时间戳并使用OOSM历史回溯；任何帧率下仅做位置PID都不可靠。</w:t>
+        <w:t>新机构和约30 Hz IMU源样本下，三种视觉帧率都能通过正常车辆场景，但启停/刹车/坑洼场景全部失败；帧率从30提高到100 Hz没有消除物理限角、机构限速和低速IMU前馈造成的包线限制。100 Hz仍是推荐视觉基线，但优化优先级应放在车辆加速度规划、115200/200 Hz IMU升级和RS00机构辨识，而不是继续盲目提高相机帧率。</w:t>
+      </w:r>
+    </w:p>
+    <w:p>
+      <w:pPr/>
+      <w:r>
+        <w:rPr>
+          <w:rFonts w:ascii="Calibri" w:hAnsi="Calibri" w:eastAsia="Microsoft YaHei"/>
+          <w:color w:val="111827"/>
+        </w:rPr>
+        <w:t>2026年7月31日模板匹配/投影标定版本部署后，钢球中部静置只读采样15.026 s，共1739帧；按capture_time_us去重仍为1739帧，found=true为1739/1739，有效率115.731 Hz。位置标准差0.25661 mm，相对中位数P95绝对偏差0.56805 mm，中心x标准差0.4677 px；处理耗时P95为1.442 ms。当前Simulink仍保守使用1.5 mm视觉噪声标准差，因为静态重复性不包含动态真值误差、曝光延迟和车辆振动。固定10 px半径、固定面积和临时confidence也不能作为正式质量门。</w:t>
       </w:r>
     </w:p>
     <w:p>
@@ -7977,7 +8322,7 @@
                 <w:color w:val="111827"/>
                 <w:sz w:val="18"/>
               </w:rPr>
-              <w:t>500 Hz</w:t>
+              <w:t>源事件约29 Hz</w:t>
             </w:r>
           </w:p>
         </w:tc>
@@ -8004,7 +8349,7 @@
                 <w:color w:val="111827"/>
                 <w:sz w:val="18"/>
               </w:rPr>
-              <w:t>接收原始IMU或姿态/轴向加速度及采样时间戳</w:t>
+              <w:t>按源序号接收姿态/轴向加速度和采样时间戳</w:t>
             </w:r>
           </w:p>
         </w:tc>
@@ -8367,12 +8712,17 @@
     </w:p>
     <w:p>
       <w:pPr>
-        <w:numPr>
-          <w:ilvl w:val="0"/>
-          <w:numId w:val="90"/>
-        </w:numPr>
         <w:spacing w:after="160"/>
+        <w:ind w:left="576" w:hanging="403"/>
       </w:pPr>
+      <w:r>
+        <w:rPr>
+          <w:rFonts w:ascii="Calibri" w:hAnsi="Calibri" w:eastAsia="Microsoft YaHei"/>
+          <w:color w:val="111827"/>
+          <w:sz w:val="22"/>
+        </w:rPr>
+        <w:t xml:space="preserve">•  </w:t>
+      </w:r>
       <w:r>
         <w:rPr>
           <w:rFonts w:ascii="Calibri" w:hAnsi="Calibri" w:eastAsia="Microsoft YaHei"/>
@@ -8384,12 +8734,17 @@
     </w:p>
     <w:p>
       <w:pPr>
-        <w:numPr>
-          <w:ilvl w:val="0"/>
-          <w:numId w:val="90"/>
-        </w:numPr>
         <w:spacing w:after="160"/>
+        <w:ind w:left="576" w:hanging="403"/>
       </w:pPr>
+      <w:r>
+        <w:rPr>
+          <w:rFonts w:ascii="Calibri" w:hAnsi="Calibri" w:eastAsia="Microsoft YaHei"/>
+          <w:color w:val="111827"/>
+          <w:sz w:val="22"/>
+        </w:rPr>
+        <w:t xml:space="preserve">•  </w:t>
+      </w:r>
       <w:r>
         <w:rPr>
           <w:rFonts w:ascii="Calibri" w:hAnsi="Calibri" w:eastAsia="Microsoft YaHei"/>
@@ -8401,12 +8756,17 @@
     </w:p>
     <w:p>
       <w:pPr>
-        <w:numPr>
-          <w:ilvl w:val="0"/>
-          <w:numId w:val="90"/>
-        </w:numPr>
         <w:spacing w:after="160"/>
+        <w:ind w:left="576" w:hanging="403"/>
       </w:pPr>
+      <w:r>
+        <w:rPr>
+          <w:rFonts w:ascii="Calibri" w:hAnsi="Calibri" w:eastAsia="Microsoft YaHei"/>
+          <w:color w:val="111827"/>
+          <w:sz w:val="22"/>
+        </w:rPr>
+        <w:t xml:space="preserve">•  </w:t>
+      </w:r>
       <w:r>
         <w:rPr>
           <w:rFonts w:ascii="Calibri" w:hAnsi="Calibri" w:eastAsia="Microsoft YaHei"/>
@@ -8418,11 +8778,8 @@
     </w:p>
     <w:p>
       <w:pPr>
-        <w:numPr>
-          <w:ilvl w:val="0"/>
-          <w:numId w:val="90"/>
-        </w:numPr>
         <w:spacing w:after="160"/>
+        <w:ind w:left="576" w:hanging="403"/>
       </w:pPr>
       <w:r>
         <w:rPr>
@@ -8430,17 +8787,30 @@
           <w:color w:val="111827"/>
           <w:sz w:val="22"/>
         </w:rPr>
-        <w:t>IMU数据超过10 ms：取消车辆前馈，禁止继续加速。</w:t>
+        <w:t xml:space="preserve">•  </w:t>
+      </w:r>
+      <w:r>
+        <w:rPr>
+          <w:rFonts w:ascii="Calibri" w:hAnsi="Calibri" w:eastAsia="Microsoft YaHei"/>
+          <w:color w:val="111827"/>
+          <w:sz w:val="22"/>
+        </w:rPr>
+        <w:t>IMU唯一源样本超过100 ms：取消车辆前馈，禁止继续加速。</w:t>
       </w:r>
     </w:p>
     <w:p>
       <w:pPr>
-        <w:numPr>
-          <w:ilvl w:val="0"/>
-          <w:numId w:val="90"/>
-        </w:numPr>
         <w:spacing w:after="160"/>
+        <w:ind w:left="576" w:hanging="403"/>
       </w:pPr>
+      <w:r>
+        <w:rPr>
+          <w:rFonts w:ascii="Calibri" w:hAnsi="Calibri" w:eastAsia="Microsoft YaHei"/>
+          <w:color w:val="111827"/>
+          <w:sz w:val="22"/>
+        </w:rPr>
+        <w:t xml:space="preserve">•  </w:t>
+      </w:r>
       <w:r>
         <w:rPr>
           <w:rFonts w:ascii="Calibri" w:hAnsi="Calibri" w:eastAsia="Microsoft YaHei"/>
@@ -8470,11 +8840,8 @@
     </w:p>
     <w:p>
       <w:pPr>
-        <w:numPr>
-          <w:ilvl w:val="0"/>
-          <w:numId w:val="91"/>
-        </w:numPr>
         <w:spacing w:after="160"/>
+        <w:ind w:left="576" w:hanging="403"/>
       </w:pPr>
       <w:r>
         <w:rPr>
@@ -8482,17 +8849,30 @@
           <w:color w:val="111827"/>
           <w:sz w:val="22"/>
         </w:rPr>
-        <w:t>机构标定：测量所有销轴中心距、C/O轴高度与水平距离；用电子水平仪记录−8°、−4°、0°、4°、8°时的RS00编码器角。</w:t>
+        <w:t xml:space="preserve">1.  </w:t>
+      </w:r>
+      <w:r>
+        <w:rPr>
+          <w:rFonts w:ascii="Calibri" w:hAnsi="Calibri" w:eastAsia="Microsoft YaHei"/>
+          <w:color w:val="111827"/>
+          <w:sz w:val="22"/>
+        </w:rPr>
+        <w:t>机构标定：测量所有销轴中心距、C/O轴高度与水平距离；用电子水平仪记录−6°、−4°、0°、4°、6°时的RS00编码器角。</w:t>
       </w:r>
     </w:p>
     <w:p>
       <w:pPr>
-        <w:numPr>
-          <w:ilvl w:val="0"/>
-          <w:numId w:val="91"/>
-        </w:numPr>
         <w:spacing w:after="160"/>
+        <w:ind w:left="576" w:hanging="403"/>
       </w:pPr>
+      <w:r>
+        <w:rPr>
+          <w:rFonts w:ascii="Calibri" w:hAnsi="Calibri" w:eastAsia="Microsoft YaHei"/>
+          <w:color w:val="111827"/>
+          <w:sz w:val="22"/>
+        </w:rPr>
+        <w:t xml:space="preserve">2.  </w:t>
+      </w:r>
       <w:r>
         <w:rPr>
           <w:rFonts w:ascii="Calibri" w:hAnsi="Calibri" w:eastAsia="Microsoft YaHei"/>
@@ -8504,12 +8884,17 @@
     </w:p>
     <w:p>
       <w:pPr>
-        <w:numPr>
-          <w:ilvl w:val="0"/>
-          <w:numId w:val="91"/>
-        </w:numPr>
         <w:spacing w:after="160"/>
+        <w:ind w:left="576" w:hanging="403"/>
       </w:pPr>
+      <w:r>
+        <w:rPr>
+          <w:rFonts w:ascii="Calibri" w:hAnsi="Calibri" w:eastAsia="Microsoft YaHei"/>
+          <w:color w:val="111827"/>
+          <w:sz w:val="22"/>
+        </w:rPr>
+        <w:t xml:space="preserve">3.  </w:t>
+      </w:r>
       <w:r>
         <w:rPr>
           <w:rFonts w:ascii="Calibri" w:hAnsi="Calibri" w:eastAsia="Microsoft YaHei"/>
@@ -8521,12 +8906,17 @@
     </w:p>
     <w:p>
       <w:pPr>
-        <w:numPr>
-          <w:ilvl w:val="0"/>
-          <w:numId w:val="91"/>
-        </w:numPr>
         <w:spacing w:after="160"/>
+        <w:ind w:left="576" w:hanging="403"/>
       </w:pPr>
+      <w:r>
+        <w:rPr>
+          <w:rFonts w:ascii="Calibri" w:hAnsi="Calibri" w:eastAsia="Microsoft YaHei"/>
+          <w:color w:val="111827"/>
+          <w:sz w:val="22"/>
+        </w:rPr>
+        <w:t xml:space="preserve">4.  </w:t>
+      </w:r>
       <w:r>
         <w:rPr>
           <w:rFonts w:ascii="Calibri" w:hAnsi="Calibri" w:eastAsia="Microsoft YaHei"/>
@@ -8538,12 +8928,17 @@
     </w:p>
     <w:p>
       <w:pPr>
-        <w:numPr>
-          <w:ilvl w:val="0"/>
-          <w:numId w:val="91"/>
-        </w:numPr>
         <w:spacing w:after="160"/>
+        <w:ind w:left="576" w:hanging="403"/>
       </w:pPr>
+      <w:r>
+        <w:rPr>
+          <w:rFonts w:ascii="Calibri" w:hAnsi="Calibri" w:eastAsia="Microsoft YaHei"/>
+          <w:color w:val="111827"/>
+          <w:sz w:val="22"/>
+        </w:rPr>
+        <w:t xml:space="preserve">5.  </w:t>
+      </w:r>
       <w:r>
         <w:rPr>
           <w:rFonts w:ascii="Calibri" w:hAnsi="Calibri" w:eastAsia="Microsoft YaHei"/>
@@ -8555,11 +8950,8 @@
     </w:p>
     <w:p>
       <w:pPr>
-        <w:numPr>
-          <w:ilvl w:val="0"/>
-          <w:numId w:val="91"/>
-        </w:numPr>
         <w:spacing w:after="160"/>
+        <w:ind w:left="576" w:hanging="403"/>
       </w:pPr>
       <w:r>
         <w:rPr>
@@ -8567,17 +8959,30 @@
           <w:color w:val="111827"/>
           <w:sz w:val="22"/>
         </w:rPr>
-        <w:t>台架闭环：先限制水管±2°和约0.8 N·m，再逐步开放到±5°、±8°。</w:t>
+        <w:t xml:space="preserve">6.  </w:t>
+      </w:r>
+      <w:r>
+        <w:rPr>
+          <w:rFonts w:ascii="Calibri" w:hAnsi="Calibri" w:eastAsia="Microsoft YaHei"/>
+          <w:color w:val="111827"/>
+          <w:sz w:val="22"/>
+        </w:rPr>
+        <w:t>台架闭环：先限制水管±2°和约0.8 N·m，再逐步开放到±4°、±5.5°、±6°。</w:t>
       </w:r>
     </w:p>
     <w:p>
       <w:pPr>
-        <w:numPr>
-          <w:ilvl w:val="0"/>
-          <w:numId w:val="91"/>
-        </w:numPr>
         <w:spacing w:after="160"/>
+        <w:ind w:left="576" w:hanging="403"/>
       </w:pPr>
+      <w:r>
+        <w:rPr>
+          <w:rFonts w:ascii="Calibri" w:hAnsi="Calibri" w:eastAsia="Microsoft YaHei"/>
+          <w:color w:val="111827"/>
+          <w:sz w:val="22"/>
+        </w:rPr>
+        <w:t xml:space="preserve">7.  </w:t>
+      </w:r>
       <w:r>
         <w:rPr>
           <w:rFonts w:ascii="Calibri" w:hAnsi="Calibri" w:eastAsia="Microsoft YaHei"/>
@@ -8624,12 +9029,17 @@
     </w:p>
     <w:p>
       <w:pPr>
-        <w:numPr>
-          <w:ilvl w:val="0"/>
-          <w:numId w:val="90"/>
-        </w:numPr>
         <w:spacing w:after="160"/>
+        <w:ind w:left="576" w:hanging="403"/>
       </w:pPr>
+      <w:r>
+        <w:rPr>
+          <w:rFonts w:ascii="Calibri" w:hAnsi="Calibri" w:eastAsia="Microsoft YaHei"/>
+          <w:color w:val="111827"/>
+          <w:sz w:val="22"/>
+        </w:rPr>
+        <w:t xml:space="preserve">•  </w:t>
+      </w:r>
       <w:r>
         <w:rPr>
           <w:rFonts w:ascii="Calibri" w:hAnsi="Calibri" w:eastAsia="Microsoft YaHei"/>
@@ -8641,12 +9051,17 @@
     </w:p>
     <w:p>
       <w:pPr>
-        <w:numPr>
-          <w:ilvl w:val="0"/>
-          <w:numId w:val="90"/>
-        </w:numPr>
         <w:spacing w:after="160"/>
+        <w:ind w:left="576" w:hanging="403"/>
       </w:pPr>
+      <w:r>
+        <w:rPr>
+          <w:rFonts w:ascii="Calibri" w:hAnsi="Calibri" w:eastAsia="Microsoft YaHei"/>
+          <w:color w:val="111827"/>
+          <w:sz w:val="22"/>
+        </w:rPr>
+        <w:t xml:space="preserve">•  </w:t>
+      </w:r>
       <w:r>
         <w:rPr>
           <w:rFonts w:ascii="Calibri" w:hAnsi="Calibri" w:eastAsia="Microsoft YaHei"/>
@@ -8658,11 +9073,8 @@
     </w:p>
     <w:p>
       <w:pPr>
-        <w:numPr>
-          <w:ilvl w:val="0"/>
-          <w:numId w:val="90"/>
-        </w:numPr>
         <w:spacing w:after="160"/>
+        <w:ind w:left="576" w:hanging="403"/>
       </w:pPr>
       <w:r>
         <w:rPr>
@@ -8670,16 +9082,21 @@
           <w:color w:val="111827"/>
           <w:sz w:val="22"/>
         </w:rPr>
-        <w:t>按O轴38 mm、主动杆51.5 mm、蓝杆65.5 mm和水管250 mm，建议C轴中心82 mm，暂定软件硬限角±8°。</w:t>
+        <w:t xml:space="preserve">•  </w:t>
+      </w:r>
+      <w:r>
+        <w:rPr>
+          <w:rFonts w:ascii="Calibri" w:hAnsi="Calibri" w:eastAsia="Microsoft YaHei"/>
+          <w:color w:val="111827"/>
+          <w:sz w:val="22"/>
+        </w:rPr>
+        <w:t>当前实测机构为O轴38 mm、C轴93 mm、O-C水平285 mm、OA 35.0 mm、AB 55.5 mm、CB 300.1 mm，软件硬指令限角暂定±6°。</w:t>
       </w:r>
     </w:p>
     <w:p>
       <w:pPr>
-        <w:numPr>
-          <w:ilvl w:val="0"/>
-          <w:numId w:val="90"/>
-        </w:numPr>
         <w:spacing w:after="160"/>
+        <w:ind w:left="576" w:hanging="403"/>
       </w:pPr>
       <w:r>
         <w:rPr>
@@ -8687,17 +9104,30 @@
           <w:color w:val="111827"/>
           <w:sz w:val="22"/>
         </w:rPr>
-        <w:t>PSoC E84直接控制RS00并承担最终安全；MSPM0只负责500 Hz IMU采集，树莓派只提供视觉。</w:t>
+        <w:t xml:space="preserve">•  </w:t>
+      </w:r>
+      <w:r>
+        <w:rPr>
+          <w:rFonts w:ascii="Calibri" w:hAnsi="Calibri" w:eastAsia="Microsoft YaHei"/>
+          <w:color w:val="111827"/>
+          <w:sz w:val="22"/>
+        </w:rPr>
+        <w:t>PSoC E84直接控制RS00并承担最终安全；MSPM0发布带源序号的车身IMU，树莓派只提供视觉。</w:t>
       </w:r>
     </w:p>
     <w:p>
       <w:pPr>
-        <w:numPr>
-          <w:ilvl w:val="0"/>
-          <w:numId w:val="90"/>
-        </w:numPr>
         <w:spacing w:after="160"/>
+        <w:ind w:left="576" w:hanging="403"/>
       </w:pPr>
+      <w:r>
+        <w:rPr>
+          <w:rFonts w:ascii="Calibri" w:hAnsi="Calibri" w:eastAsia="Microsoft YaHei"/>
+          <w:color w:val="111827"/>
+          <w:sz w:val="22"/>
+        </w:rPr>
+        <w:t xml:space="preserve">•  </w:t>
+      </w:r>
       <w:r>
         <w:rPr>
           <w:rFonts w:ascii="Calibri" w:hAnsi="Calibri" w:eastAsia="Microsoft YaHei"/>
@@ -8709,11 +9139,8 @@
     </w:p>
     <w:p>
       <w:pPr>
-        <w:numPr>
-          <w:ilvl w:val="0"/>
-          <w:numId w:val="90"/>
-        </w:numPr>
         <w:spacing w:after="160"/>
+        <w:ind w:left="576" w:hanging="403"/>
       </w:pPr>
       <w:r>
         <w:rPr>
@@ -8721,7 +9148,15 @@
           <w:color w:val="111827"/>
           <w:sz w:val="22"/>
         </w:rPr>
-        <w:t>地图速度规划必须限制车辆加减速度和加加速度；正常起步建议先按0.6–0.8 m/s²以下设计，并由实车数据继续收紧。</w:t>
+        <w:t xml:space="preserve">•  </w:t>
+      </w:r>
+      <w:r>
+        <w:rPr>
+          <w:rFonts w:ascii="Calibri" w:hAnsi="Calibri" w:eastAsia="Microsoft YaHei"/>
+          <w:color w:val="111827"/>
+          <w:sz w:val="22"/>
+        </w:rPr>
+        <w:t>地图速度规划必须限制车辆加减速度和加加速度；正常起步建议先按0.4–0.6 m/s²以下设计，并由实车数据继续收紧。</w:t>
       </w:r>
     </w:p>
     <w:p>
@@ -9817,7 +10252,7 @@
                 <w:color w:val="111827"/>
                 <w:sz w:val="17"/>
               </w:rPr>
-              <w:t>±8°</w:t>
+              <w:t>±6°</w:t>
             </w:r>
           </w:p>
         </w:tc>
@@ -9844,7 +10279,7 @@
                 <w:color w:val="111827"/>
                 <w:sz w:val="17"/>
               </w:rPr>
-              <w:t>暂定硬限位</w:t>
+              <w:t>新机构暂定硬指令限位</w:t>
             </w:r>
           </w:p>
         </w:tc>
@@ -9900,7 +10335,7 @@
                 <w:color w:val="111827"/>
                 <w:sz w:val="17"/>
               </w:rPr>
-              <w:t>1.2 rad/s</w:t>
+              <w:t>0.35 rad/s</w:t>
             </w:r>
           </w:p>
         </w:tc>
@@ -9927,7 +10362,7 @@
                 <w:color w:val="111827"/>
                 <w:sz w:val="17"/>
               </w:rPr>
-              <w:t>模型限值</w:t>
+              <w:t>按最差雅可比和RS00限速保守设置</w:t>
             </w:r>
           </w:p>
         </w:tc>
@@ -9956,7 +10391,7 @@
                 <w:color w:val="111827"/>
                 <w:sz w:val="17"/>
               </w:rPr>
-              <w:t>控制/IMU/视觉</w:t>
+              <w:t>控制/IMU唯一源样本/视觉</w:t>
             </w:r>
           </w:p>
         </w:tc>
@@ -9983,7 +10418,7 @@
                 <w:color w:val="111827"/>
                 <w:sz w:val="17"/>
               </w:rPr>
-              <w:t>200 / 500 / 100 Hz</w:t>
+              <w:t>200 / 约30 / 100 Hz</w:t>
             </w:r>
           </w:p>
         </w:tc>
@@ -10010,7 +10445,7 @@
                 <w:color w:val="111827"/>
                 <w:sz w:val="17"/>
               </w:rPr>
-              <w:t>任务设计</w:t>
+              <w:t>当前模型</w:t>
             </w:r>
           </w:p>
         </w:tc>
@@ -10149,7 +10584,7 @@
                 <w:color w:val="111827"/>
                 <w:sz w:val="17"/>
               </w:rPr>
-              <w:t>4 ms</w:t>
+              <w:t>35 ms</w:t>
             </w:r>
           </w:p>
         </w:tc>
@@ -10176,7 +10611,7 @@
                 <w:color w:val="111827"/>
                 <w:sz w:val="17"/>
               </w:rPr>
-              <w:t>模型假设</w:t>
+              <w:t>当前WIT串行组+处理近似</w:t>
             </w:r>
           </w:p>
         </w:tc>
@@ -10315,7 +10750,7 @@
                 <w:color w:val="111827"/>
                 <w:sz w:val="17"/>
               </w:rPr>
-              <w:t>[3.328, 1.033, 0.9997]</w:t>
+              <w:t>[2.650, 0.910, 0.787]</w:t>
             </w:r>
           </w:p>
         </w:tc>
@@ -10342,7 +10777,7 @@
                 <w:color w:val="111827"/>
                 <w:sz w:val="17"/>
               </w:rPr>
-              <w:t>按40 mm尺度，非最终1 cm参数</w:t>
+              <w:t>新限角下自动设计，仍须台架辨识</w:t>
             </w:r>
           </w:p>
         </w:tc>
@@ -10371,7 +10806,7 @@
                 <w:color w:val="111827"/>
                 <w:sz w:val="17"/>
               </w:rPr>
-              <w:t>8 mm尺度候选增益</w:t>
+              <w:t>机构安全工作区</w:t>
             </w:r>
           </w:p>
         </w:tc>
@@ -10398,7 +10833,7 @@
                 <w:color w:val="111827"/>
                 <w:sz w:val="17"/>
               </w:rPr>
-              <w:t>[14.854, 2.086, 0.981]</w:t>
+              <w:t>−6°到+6°</w:t>
             </w:r>
           </w:p>
         </w:tc>
@@ -10425,7 +10860,7 @@
                 <w:color w:val="111827"/>
                 <w:sz w:val="17"/>
               </w:rPr>
-              <w:t>必须重新仿真和台架验证</w:t>
+              <w:t>最小|dθ/dq|=0.0467</w:t>
             </w:r>
           </w:p>
         </w:tc>
@@ -10751,47 +11186,6 @@
   </w:num>
   <w:num w:numId="9">
     <w:abstractNumId w:val="0"/>
-  </w:num>
-  <w:abstractNum w:abstractNumId="90">
-    <w:multiLevelType w:val="singleLevel"/>
-    <w:lvl w:ilvl="0">
-      <w:start w:val="1"/>
-      <w:numFmt w:val="bullet"/>
-      <w:lvlText w:val="•"/>
-      <w:lvlJc w:val="left"/>
-      <w:pPr>
-        <w:tabs>
-          <w:tab w:val="num" w:pos="720"/>
-        </w:tabs>
-        <w:ind w:left="720" w:hanging="360"/>
-        <w:spacing w:after="160" w:line="280" w:lineRule="auto"/>
-      </w:pPr>
-      <w:rPr>
-        <w:rFonts w:ascii="Symbol" w:hAnsi="Symbol"/>
-      </w:rPr>
-    </w:lvl>
-  </w:abstractNum>
-  <w:num w:numId="90">
-    <w:abstractNumId w:val="90"/>
-  </w:num>
-  <w:abstractNum w:abstractNumId="91">
-    <w:multiLevelType w:val="singleLevel"/>
-    <w:lvl w:ilvl="0">
-      <w:start w:val="1"/>
-      <w:numFmt w:val="decimal"/>
-      <w:lvlText w:val="%1."/>
-      <w:lvlJc w:val="left"/>
-      <w:pPr>
-        <w:tabs>
-          <w:tab w:val="num" w:pos="720"/>
-        </w:tabs>
-        <w:ind w:left="720" w:hanging="360"/>
-        <w:spacing w:after="160" w:line="280" w:lineRule="auto"/>
-      </w:pPr>
-    </w:lvl>
-  </w:abstractNum>
-  <w:num w:numId="91">
-    <w:abstractNumId w:val="91"/>
   </w:num>
 </w:numbering>
 </file>

</xml_diff>